<commit_message>
docs: confirm MVP categories and founding season priorities
</commit_message>
<xml_diff>
--- a/Informe_Tecnico_Funcional_AI_Tools_Arena.docx
+++ b/Informe_Tecnico_Funcional_AI_Tools_Arena.docx
@@ -1564,13 +1564,7 @@
         <w:spacing w:after="120" w:line="264" w:lineRule="auto"/>
       </w:pPr>
       <w:r>
-        <w:rPr>
-          <w:rFonts w:ascii="Calibri" w:hAnsi="Calibri"/>
-          <w:i w:val="0"/>
-          <w:color w:val="1D2939"/>
-          <w:sz w:val="22"/>
-        </w:rPr>
-        <w:t>Categoría de producto: plataforma de descubrimiento y adquisición B2B con componentes de directorio, comunidad, competición, publicidad, analítica y generación de oportunidades.</w:t>
+        <w:t>Categoría de producto: plataforma internacional de descubrimiento, evaluación y adquisición de herramientas de IA y automatización, con experiencias B2B, B2C y profesionales, además de directorio, comunidad, competición, publicidad, analítica y generación de oportunidades.</w:t>
       </w:r>
     </w:p>
     <w:p>
@@ -2420,13 +2414,7 @@
         <w:spacing w:after="120" w:line="264" w:lineRule="auto"/>
       </w:pPr>
       <w:r>
-        <w:rPr>
-          <w:rFonts w:ascii="Calibri" w:hAnsi="Calibri"/>
-          <w:i w:val="0"/>
-          <w:color w:val="1D2939"/>
-          <w:sz w:val="22"/>
-        </w:rPr>
-        <w:t>El lanzamiento se enfocará en España. Según el INE, en el primer trimestre de 2025 utilizaba IA el 21,1% de las empresas de diez o más empleados y el 13,39% de las empresas de menos de diez empleados. El dato sugiere adopción creciente y, a la vez, un amplio segmento que necesita orientación. La plataforma deberá traducir capacidades técnicas a beneficios operativos y no dirigirse únicamente a usuarios avanzados.</w:t>
+        <w:t>El lanzamiento se enfocará inicialmente en España como mercado de validación. La plataforma atenderá empresas, autónomos, profesionales y usuarios particulares, y deberá poder evolucionar hacia otros mercados e idiomas. Según el INE, en el primer trimestre de 2025 utilizaba IA el 21,1% de las empresas de diez o más empleados y el 13,39% de las empresas de menos de diez empleados. El producto deberá traducir capacidades técnicas a beneficios operativos y personales, sin dirigirse únicamente a usuarios avanzados.</w:t>
       </w:r>
     </w:p>
     <w:p>
@@ -2434,7 +2422,7 @@
         <w:pStyle w:val="Heading3"/>
       </w:pPr>
       <w:r>
-        <w:t>3.1 Segmentación prioritaria de demanda</w:t>
+        <w:t>3.1 Segmentación y categorías iniciales confirmadas</w:t>
       </w:r>
     </w:p>
     <w:tbl>
@@ -2930,6 +2918,42 @@
       <w:pPr>
         <w:spacing w:after="80"/>
       </w:pPr>
+    </w:p>
+    <w:p>
+      <w:pPr/>
+      <w:r>
+        <w:t>La primera Founding Season priorizará las tres primeras categorías, con sectores y casos de uso más específicos gestionados inicialmente mediante etiquetas.</w:t>
+      </w:r>
+    </w:p>
+    <w:p>
+      <w:pPr/>
+      <w:r>
+        <w:t>Desarrollo, datos y tecnología. Incluye programación, testing, análisis de datos, bases de datos, documentación técnica y creación de aplicaciones.</w:t>
+      </w:r>
+    </w:p>
+    <w:p>
+      <w:pPr/>
+      <w:r>
+        <w:t>Ventas, atención al cliente y operaciones. Incluye chatbots, CRM, captación, soporte, correo comercial y procesos operativos.</w:t>
+      </w:r>
+    </w:p>
+    <w:p>
+      <w:pPr/>
+      <w:r>
+        <w:t>Automatización, agentes e integraciones. Incluye workflows, agentes, RPA, integraciones, APIs y tareas repetitivas.</w:t>
+      </w:r>
+    </w:p>
+    <w:p>
+      <w:pPr/>
+      <w:r>
+        <w:t>Contenido, marketing y creatividad. Incluye texto, imagen, vídeo, audio, diseño, redes sociales y presentaciones.</w:t>
+      </w:r>
+    </w:p>
+    <w:p>
+      <w:pPr/>
+      <w:r>
+        <w:t>Productividad y conocimiento. Incluye documentos, búsqueda, investigación, reuniones, notas y escritura.</w:t>
+      </w:r>
     </w:p>
     <w:p>
       <w:pPr>
@@ -27707,6 +27731,9 @@
       <w:pPr>
         <w:spacing w:after="80"/>
       </w:pPr>
+      <w:r>
+        <w:t>Decisión adoptada: el MVP tendrá cinco categorías principales; la primera Founding Season priorizará Productividad y conocimiento, Contenido, marketing y creatividad, y Automatización, agentes e integraciones.</w:t>
+      </w:r>
     </w:p>
     <w:p>
       <w:pPr>

</xml_diff>